<commit_message>
Replace all stored procedure references with SSIS package architecture
</commit_message>
<xml_diff>
--- a/docs/Final_Report.docx
+++ b/docs/Final_Report.docx
@@ -378,7 +378,7 @@
         <w:jc w:val="both"/>
       </w:pPr>
       <w:r>
-        <w:t>The implementation employs Data Vault 2.0’s hub-satellite-link pattern within a four-layer medallion architecture: Staging (9 source tables), Bronze (9 Hubs, 10 Satellites, 5 Links), Silver (3 Point-in-Time tables, 1 Bridge, 2 Business Vault tables), and Gold (7 Dimensions, 4 Fact tables in a star schema). The ETL pipeline is orchestrated through 49 SSIS child packages with a master package and 15 stored procedures, providing batch-and-step logging, watermark-based incremental loading, and error handling. A simulated tax database with 1,000 taxpayers, declarations, payments, and officer assignments serves as the source system, totalling 50 tables across six databases.</w:t>
+        <w:t>The implementation employs Data Vault 2.0’s hub-satellite-link pattern within a four-layer medallion architecture: Staging (9 source tables), Bronze (9 Hubs, 10 Satellites, 5 Links), Silver (3 Point-in-Time tables, 1 Bridge, 2 Business Vault tables), and Gold (7 Dimensions, 4 Fact tables in a star schema). The ETL pipeline is orchestrated through 49 SSIS child packages with a master package and 49 SSIS child packages, providing batch-and-step logging, watermark-based incremental loading, and error handling. A simulated tax database with 1,000 taxpayers, declarations, payments, and officer assignments serves as the source system, totalling 50 tables across six databases.</w:t>
       </w:r>
     </w:p>
     <w:p>
@@ -1836,7 +1836,7 @@
         <w:spacing w:after="60" w:line="360" w:lineRule="auto"/>
       </w:pPr>
       <w:r>
-        <w:t>To develop a comprehensive ETL pipeline with stored procedures supporting both full and incremental loading with watermark-based change detection.</w:t>
+        <w:t>To develop a comprehensive ETL pipeline with SSIS packages supporting both full and incremental loading with watermark-based change detection.</w:t>
       </w:r>
     </w:p>
     <w:p>
@@ -1941,7 +1941,7 @@
         <w:spacing w:after="60" w:line="360" w:lineRule="auto"/>
       </w:pPr>
       <w:r>
-        <w:t>A complete, reproducible implementation of a four-layer medallion architecture (Staging, Bronze, Silver, Gold) using Data Vault 2.0 methodology on Microsoft SQL Server, comprising 50 database tables and 15 stored procedures (ETL control and staging helpers). This represents the first published end-to-end DV2 + Medallion implementation for the government tax administration domain, addressing the gap identified across all four reviewed studies [9][10][11][12].</w:t>
+        <w:t>A complete, reproducible implementation of a four-layer medallion architecture (Staging, Bronze, Silver, Gold) using Data Vault 2.0 methodology on Microsoft SQL Server, comprising 50 database tables and 49 SSIS packages. This represents the first published end-to-end DV2 + Medallion implementation for the government tax administration domain, addressing the gap identified across all four reviewed studies [9][10][11][12].</w:t>
       </w:r>
     </w:p>
     <w:p>
@@ -3921,7 +3921,7 @@
               <w:jc w:val="center"/>
             </w:pPr>
             <w:r>
-              <w:t>Detailed error logging with severity, source, and message (4-param usp_LogError)</w:t>
+              <w:t>Detailed error logging with severity, source, and message (SSIS OnError Event Handler with Script Task)</w:t>
             </w:r>
           </w:p>
         </w:tc>
@@ -6256,7 +6256,7 @@
         <w:jc w:val="both"/>
       </w:pPr>
       <w:r>
-        <w:t>The ETL pipeline is executed through a master orchestration procedure (usp_MasterETL_FullLoad_Complete) that calls layer-specific procedures in dependency order. SSIS packages wrap these procedures for scheduled execution through SQL Server Agent, supporting both full load and incremental load modes.</w:t>
+        <w:t>The ETL pipeline is executed through a hierarchical SSIS package design with Master_Complete_Pipeline.dtsx as the entry point, branching to Master_Full_Load.dtsx or Master_Incremental_Load.dtsx based on watermark state. Each master package orchestrates layer-specific child packages in dependency order, supporting both full load and incremental load modes.</w:t>
       </w:r>
     </w:p>
     <w:p>
@@ -7482,7 +7482,7 @@
         <w:spacing w:after="60" w:line="360" w:lineRule="auto"/>
       </w:pPr>
       <w:r>
-        <w:t>Error Handling: Standardized error capture with TRY-CATCH blocks and error message logging at both batch and step levels.</w:t>
+        <w:t>Error Handling: Standardized error capture with SSIS OnError Event Handlers and error message logging at both batch and step levels.</w:t>
       </w:r>
     </w:p>
     <w:p>
@@ -8343,7 +8343,7 @@
         <w:jc w:val="both"/>
       </w:pPr>
       <w:r>
-        <w:t>Each procedure wraps its logic in TRY-CATCH blocks. Errors are logged to both ETL_StepLog (step-level status) and ETL_ErrorLog (detailed error information including ErrorSeverity, ErrorSource, and ErrorMessage columns). The usp_LogError procedure accepts six parameters (@BatchID, @StepLogID, @ErrorSeverity, @ErrorSource, @ErrorMessage, @ErrorDetails) enabling precise error categorization and detailed diagnostics. The master orchestration continues processing subsequent steps even if individual steps fail, accumulating an error count for the final batch status. SSIS packages implement OnError event handlers at both child package and orchestrator levels, with error propagation control to ensure sibling packages can continue execution when independent steps fail.</w:t>
+        <w:t>Each SSIS child package includes an OnError Event Handler that captures errors. Errors are logged to both ETL_StepLog (step-level status) and ETL_ErrorLog (detailed error information including ErrorSeverity, ErrorSource, and ErrorMessage columns). A Script Task within the OnError handler accepts six parameters (@BatchID, @StepLogID, @ErrorSeverity, @ErrorSource, @ErrorMessage, @ErrorDetails) enabling precise error categorization and detailed diagnostics. The master orchestration continues processing subsequent steps even if individual steps fail, accumulating an error count for the final batch status. SSIS packages implement OnError event handlers at both child package and orchestrator levels, with error propagation control to ensure sibling packages can continue execution when independent steps fail.</w:t>
       </w:r>
     </w:p>
     <w:p>
@@ -8680,7 +8680,7 @@
               <w:jc w:val="center"/>
             </w:pPr>
             <w:r>
-              <w:t>Stored procedures, functions, ETL logic</w:t>
+              <w:t>SSIS packages, Data Flow tasks, ETL logic</w:t>
             </w:r>
           </w:p>
         </w:tc>
@@ -8919,7 +8919,7 @@
         <w:jc w:val="both"/>
       </w:pPr>
       <w:r>
-        <w:t>Nine SSIS child packages were created, one for each source table. Each procedure follows an identical pattern: receive a BatchID parameter, start a step log entry, execute the load logic (full or incremental), update the watermark, and end the step log entry with the record count. A master wrapper procedure (usp_Master_Load_All_Staging) creates a batch and calls all nine staging procedures in sequence.</w:t>
+        <w:t>Nine SSIS child packages were created, one for each source table. Each SSIS child package follows an identical pattern: receive a BatchID parameter via Execute SQL Task, start a step log entry, execute the load logic via Data Flow task (full or incremental), update the watermark, and end the step log entry with the record count. A master SSIS package (STG_Full_Load_All.dtsx) creates a batch and calls all nine staging child packages in sequence.</w:t>
       </w:r>
     </w:p>
     <w:p>
@@ -8984,7 +8984,7 @@
                 <w:b/>
                 <w:bCs/>
               </w:rPr>
-              <w:t>Procedure</w:t>
+              <w:t>SSIS Package</w:t>
             </w:r>
           </w:p>
         </w:tc>
@@ -9068,7 +9068,7 @@
           </w:tcPr>
           <w:p>
             <w:r>
-              <w:t>usp_Load_STG_Category</w:t>
+              <w:t>STG_Load_Category.dtsx</w:t>
             </w:r>
           </w:p>
         </w:tc>
@@ -9142,7 +9142,7 @@
           </w:tcPr>
           <w:p>
             <w:r>
-              <w:t>usp_Load_STG_Structure</w:t>
+              <w:t>STG_Load_Structure.dtsx</w:t>
             </w:r>
           </w:p>
         </w:tc>
@@ -9216,7 +9216,7 @@
           </w:tcPr>
           <w:p>
             <w:r>
-              <w:t>usp_Load_STG_Activity</w:t>
+              <w:t>STG_Load_Activity.dtsx</w:t>
             </w:r>
           </w:p>
         </w:tc>
@@ -9290,7 +9290,7 @@
           </w:tcPr>
           <w:p>
             <w:r>
-              <w:t>usp_Load_STG_Taxpayer</w:t>
+              <w:t>STG_Load_Taxpayer.dtsx</w:t>
             </w:r>
           </w:p>
         </w:tc>
@@ -9364,7 +9364,7 @@
           </w:tcPr>
           <w:p>
             <w:r>
-              <w:t>usp_Load_STG_Owner</w:t>
+              <w:t>STG_Load_Owner.dtsx</w:t>
             </w:r>
           </w:p>
         </w:tc>
@@ -9438,7 +9438,7 @@
           </w:tcPr>
           <w:p>
             <w:r>
-              <w:t>usp_Load_STG_Officer</w:t>
+              <w:t>STG_Load_Officer.dtsx</w:t>
             </w:r>
           </w:p>
         </w:tc>
@@ -9512,7 +9512,7 @@
           </w:tcPr>
           <w:p>
             <w:r>
-              <w:t>usp_Load_STG_MonthlyDeclaration</w:t>
+              <w:t>STG_Load_MonthlyDeclaration.dtsx</w:t>
             </w:r>
           </w:p>
         </w:tc>
@@ -9586,7 +9586,7 @@
           </w:tcPr>
           <w:p>
             <w:r>
-              <w:t>usp_Load_STG_AnnualDeclaration</w:t>
+              <w:t>STG_Load_AnnualDeclaration.dtsx</w:t>
             </w:r>
           </w:p>
         </w:tc>
@@ -9660,7 +9660,7 @@
           </w:tcPr>
           <w:p>
             <w:r>
-              <w:t>usp_Load_STG_Payment</w:t>
+              <w:t>STG_Load_Payment.dtsx</w:t>
             </w:r>
           </w:p>
         </w:tc>
@@ -9765,7 +9765,7 @@
         <w:spacing w:after="60" w:line="360" w:lineRule="auto"/>
       </w:pPr>
       <w:r>
-        <w:t>Each procedure logs records processed, start/end times, and errors via usp_StartStep/usp_EndStep.</w:t>
+        <w:t>Each SSIS child package logs records processed, start/end times, and errors via usp_StartStep/usp_EndStep.</w:t>
       </w:r>
     </w:p>
     <w:p>
@@ -9971,7 +9971,7 @@
                 <w:b/>
                 <w:bCs/>
               </w:rPr>
-              <w:t>Procedure</w:t>
+              <w:t>SSIS Package</w:t>
             </w:r>
           </w:p>
         </w:tc>
@@ -10050,7 +10050,7 @@
               <w:jc w:val="center"/>
             </w:pPr>
             <w:r>
-              <w:t>usp_Load_HUB_Taxpayer</w:t>
+              <w:t>BRZ_Load_HUB_Taxpayer.dtsx</w:t>
             </w:r>
           </w:p>
         </w:tc>
@@ -10125,7 +10125,7 @@
               <w:jc w:val="center"/>
             </w:pPr>
             <w:r>
-              <w:t>usp_Load_HUB_Declaration</w:t>
+              <w:t>BRZ_Load_HUB_Declaration.dtsx</w:t>
             </w:r>
           </w:p>
         </w:tc>
@@ -10199,7 +10199,7 @@
               <w:jc w:val="center"/>
             </w:pPr>
             <w:r>
-              <w:t>usp_Load_HUB_Payment</w:t>
+              <w:t>BRZ_Load_HUB_Payment.dtsx</w:t>
             </w:r>
           </w:p>
         </w:tc>
@@ -10273,7 +10273,7 @@
               <w:jc w:val="center"/>
             </w:pPr>
             <w:r>
-              <w:t>usp_Load_HUB_Officer</w:t>
+              <w:t>BRZ_Load_HUB_Officer.dtsx</w:t>
             </w:r>
           </w:p>
         </w:tc>
@@ -10347,7 +10347,7 @@
               <w:jc w:val="center"/>
             </w:pPr>
             <w:r>
-              <w:t>usp_Load_HUB_Owner</w:t>
+              <w:t>BRZ_Load_HUB_Owner.dtsx</w:t>
             </w:r>
           </w:p>
         </w:tc>
@@ -10421,7 +10421,7 @@
               <w:jc w:val="center"/>
             </w:pPr>
             <w:r>
-              <w:t>usp_Load_HUB_Category</w:t>
+              <w:t>BRZ_Load_HUB_Category.dtsx</w:t>
             </w:r>
           </w:p>
         </w:tc>
@@ -10495,7 +10495,7 @@
               <w:jc w:val="center"/>
             </w:pPr>
             <w:r>
-              <w:t>usp_Load_HUB_Structure</w:t>
+              <w:t>BRZ_Load_HUB_Structure.dtsx</w:t>
             </w:r>
           </w:p>
         </w:tc>
@@ -10569,7 +10569,7 @@
               <w:jc w:val="center"/>
             </w:pPr>
             <w:r>
-              <w:t>usp_Load_HUB_Activity</w:t>
+              <w:t>BRZ_Load_HUB_Activity.dtsx</w:t>
             </w:r>
           </w:p>
         </w:tc>
@@ -10643,7 +10643,7 @@
               <w:jc w:val="center"/>
             </w:pPr>
             <w:r>
-              <w:t>usp_Load_SAT_Taxpayer</w:t>
+              <w:t>BRZ_Load_SAT_Taxpayer.dtsx</w:t>
             </w:r>
           </w:p>
         </w:tc>
@@ -10717,7 +10717,7 @@
               <w:jc w:val="center"/>
             </w:pPr>
             <w:r>
-              <w:t>usp_Load_SAT_MonthlyDecl</w:t>
+              <w:t>BRZ_Load_SAT_MonthlyDecl.dtsx</w:t>
             </w:r>
           </w:p>
         </w:tc>
@@ -10791,7 +10791,7 @@
               <w:jc w:val="center"/>
             </w:pPr>
             <w:r>
-              <w:t>usp_Load_SAT_Payment</w:t>
+              <w:t>BRZ_Load_SAT_Payment.dtsx</w:t>
             </w:r>
           </w:p>
         </w:tc>
@@ -10865,7 +10865,7 @@
               <w:jc w:val="center"/>
             </w:pPr>
             <w:r>
-              <w:t>usp_Load_SAT_Officer</w:t>
+              <w:t>BRZ_Load_SAT_Officer.dtsx</w:t>
             </w:r>
           </w:p>
         </w:tc>
@@ -10939,7 +10939,7 @@
               <w:jc w:val="center"/>
             </w:pPr>
             <w:r>
-              <w:t>usp_Load_SAT_Owner</w:t>
+              <w:t>BRZ_Load_SAT_Owner.dtsx</w:t>
             </w:r>
           </w:p>
         </w:tc>
@@ -11013,7 +11013,7 @@
               <w:jc w:val="center"/>
             </w:pPr>
             <w:r>
-              <w:t>usp_Load_SAT_Category</w:t>
+              <w:t>BRZ_Load_SAT_Category.dtsx</w:t>
             </w:r>
           </w:p>
         </w:tc>
@@ -11087,7 +11087,7 @@
               <w:jc w:val="center"/>
             </w:pPr>
             <w:r>
-              <w:t>usp_Load_SAT_Structure</w:t>
+              <w:t>BRZ_Load_SAT_Structure.dtsx</w:t>
             </w:r>
           </w:p>
         </w:tc>
@@ -11161,7 +11161,7 @@
               <w:jc w:val="center"/>
             </w:pPr>
             <w:r>
-              <w:t>usp_Load_SAT_Activity</w:t>
+              <w:t>BRZ_Load_SAT_Activity.dtsx</w:t>
             </w:r>
           </w:p>
         </w:tc>
@@ -11235,7 +11235,7 @@
               <w:jc w:val="center"/>
             </w:pPr>
             <w:r>
-              <w:t>usp_Load_LNK_TaxpayerDeclaration</w:t>
+              <w:t>BRZ_Load_LNK_TaxpayerDeclaration.dtsx</w:t>
             </w:r>
           </w:p>
         </w:tc>
@@ -11309,7 +11309,7 @@
               <w:jc w:val="center"/>
             </w:pPr>
             <w:r>
-              <w:t>usp_Load_LNK_DeclarationPayment</w:t>
+              <w:t>BRZ_Load_LNK_DeclarationPayment.dtsx</w:t>
             </w:r>
           </w:p>
         </w:tc>
@@ -11383,7 +11383,7 @@
               <w:jc w:val="center"/>
             </w:pPr>
             <w:r>
-              <w:t>usp_Load_LNK_TaxpayerOfficer</w:t>
+              <w:t>BRZ_Load_LNK_TaxpayerOfficer.dtsx</w:t>
             </w:r>
           </w:p>
         </w:tc>
@@ -11457,7 +11457,7 @@
               <w:jc w:val="center"/>
             </w:pPr>
             <w:r>
-              <w:t>usp_Load_LNK_TaxpayerAnnualDecl</w:t>
+              <w:t>BRZ_Load_LNK_TaxpayerAnnualDecl.dtsx</w:t>
             </w:r>
           </w:p>
         </w:tc>
@@ -11531,7 +11531,7 @@
               <w:jc w:val="center"/>
             </w:pPr>
             <w:r>
-              <w:t>usp_Load_LNK_TaxpayerOwner</w:t>
+              <w:t>BRZ_Load_LNK_TaxpayerOwner.dtsx</w:t>
             </w:r>
           </w:p>
         </w:tc>
@@ -11790,7 +11790,7 @@
                 <w:b/>
                 <w:bCs/>
               </w:rPr>
-              <w:t>Procedure</w:t>
+              <w:t>SSIS Package</w:t>
             </w:r>
           </w:p>
         </w:tc>
@@ -11869,7 +11869,7 @@
               <w:jc w:val="center"/>
             </w:pPr>
             <w:r>
-              <w:t>usp_Load_PIT_Taxpayer</w:t>
+              <w:t>SLV_Load_PIT_Taxpayer.dtsx</w:t>
             </w:r>
           </w:p>
         </w:tc>
@@ -11943,7 +11943,7 @@
               <w:jc w:val="center"/>
             </w:pPr>
             <w:r>
-              <w:t>usp_Load_PIT_Declaration</w:t>
+              <w:t>SLV_Load_PIT_Declaration.dtsx</w:t>
             </w:r>
           </w:p>
         </w:tc>
@@ -12017,7 +12017,7 @@
               <w:jc w:val="center"/>
             </w:pPr>
             <w:r>
-              <w:t>usp_Load_PIT_Payment</w:t>
+              <w:t>SLV_Load_PIT_Payment.dtsx</w:t>
             </w:r>
           </w:p>
         </w:tc>
@@ -12092,7 +12092,7 @@
               <w:jc w:val="center"/>
             </w:pPr>
             <w:r>
-              <w:t>usp_Load_BRG_Taxpayer_Owner</w:t>
+              <w:t>SLV_Load_BRG_TaxpayerOwner.dtsx</w:t>
             </w:r>
           </w:p>
         </w:tc>
@@ -12166,7 +12166,7 @@
               <w:jc w:val="center"/>
             </w:pPr>
             <w:r>
-              <w:t>usp_Load_BUS_ComplianceScore</w:t>
+              <w:t>SLV_Load_BUS_ComplianceScore.dtsx</w:t>
             </w:r>
           </w:p>
         </w:tc>
@@ -12240,7 +12240,7 @@
               <w:jc w:val="center"/>
             </w:pPr>
             <w:r>
-              <w:t>usp_Load_BUS_MonthlyMetrics</w:t>
+              <w:t>SLV_Load_BUS_MonthlyMetrics.dtsx</w:t>
             </w:r>
           </w:p>
         </w:tc>
@@ -12440,7 +12440,7 @@
                 <w:b/>
                 <w:bCs/>
               </w:rPr>
-              <w:t>Procedure</w:t>
+              <w:t>SSIS Package</w:t>
             </w:r>
           </w:p>
         </w:tc>
@@ -12516,7 +12516,7 @@
           </w:tcPr>
           <w:p>
             <w:r>
-              <w:t>usp_Load_DIM_Taxpayer_SCD2</w:t>
+              <w:t>GLD_Load_DIM_Taxpayer_SCD2.dtsx</w:t>
             </w:r>
           </w:p>
         </w:tc>
@@ -12587,7 +12587,7 @@
           </w:tcPr>
           <w:p>
             <w:r>
-              <w:t>usp_Load_DIM_Officer_SCD2</w:t>
+              <w:t>GLD_Load_DIM_Officer_SCD2.dtsx</w:t>
             </w:r>
           </w:p>
         </w:tc>
@@ -12658,7 +12658,7 @@
           </w:tcPr>
           <w:p>
             <w:r>
-              <w:t>usp_Load_DIM_Category</w:t>
+              <w:t>GLD_Load_DIM_Category.dtsx</w:t>
             </w:r>
           </w:p>
         </w:tc>
@@ -12729,7 +12729,7 @@
           </w:tcPr>
           <w:p>
             <w:r>
-              <w:t>usp_Load_DIM_PaymentMethod</w:t>
+              <w:t>GLD_Load_DIM_PaymentMethod.dtsx</w:t>
             </w:r>
           </w:p>
         </w:tc>
@@ -12800,7 +12800,7 @@
           </w:tcPr>
           <w:p>
             <w:r>
-              <w:t>usp_Load_DIM_Activity</w:t>
+              <w:t>GLD_Load_DIM_Activity.dtsx</w:t>
             </w:r>
           </w:p>
         </w:tc>
@@ -12871,7 +12871,7 @@
           </w:tcPr>
           <w:p>
             <w:r>
-              <w:t>usp_Load_DIM_Structure</w:t>
+              <w:t>GLD_Load_DIM_Structure.dtsx</w:t>
             </w:r>
           </w:p>
         </w:tc>
@@ -12942,7 +12942,7 @@
           </w:tcPr>
           <w:p>
             <w:r>
-              <w:t>usp_Load_DIM_Status</w:t>
+              <w:t>GLD_Load_DIM_Status.dtsx</w:t>
             </w:r>
           </w:p>
         </w:tc>
@@ -13014,7 +13014,7 @@
           </w:tcPr>
           <w:p>
             <w:r>
-              <w:t>usp_Populate_DIM_Date</w:t>
+              <w:t>GLD_Populate_DIM_Date.dtsx</w:t>
             </w:r>
           </w:p>
         </w:tc>
@@ -13085,7 +13085,7 @@
           </w:tcPr>
           <w:p>
             <w:r>
-              <w:t>usp_Load_FACT_MonthlyDeclaration</w:t>
+              <w:t>GLD_Load_FACT_MonthlyDeclaration.dtsx</w:t>
             </w:r>
           </w:p>
         </w:tc>
@@ -13156,7 +13156,7 @@
           </w:tcPr>
           <w:p>
             <w:r>
-              <w:t>usp_Load_FACT_Payment</w:t>
+              <w:t>GLD_Load_FACT_Payment.dtsx</w:t>
             </w:r>
           </w:p>
         </w:tc>
@@ -13227,7 +13227,7 @@
           </w:tcPr>
           <w:p>
             <w:r>
-              <w:t>usp_Load_FACT_MonthlySnapshot</w:t>
+              <w:t>GLD_Load_FACT_MonthlySnapshot.dtsx</w:t>
             </w:r>
           </w:p>
         </w:tc>
@@ -13298,7 +13298,7 @@
           </w:tcPr>
           <w:p>
             <w:r>
-              <w:t>usp_Load_FACT_DeclarationLifecycle</w:t>
+              <w:t>GLD_Load_FACT_DeclarationLifecycle.dtsx</w:t>
             </w:r>
           </w:p>
         </w:tc>
@@ -13382,7 +13382,7 @@
         <w:jc w:val="both"/>
       </w:pPr>
       <w:r>
-        <w:t>The master procedure usp_MasterETL_FullLoad_Complete orchestrates 40+ individual procedure calls across the four layers. Each call is wrapped in its own TRY-CATCH block, allowing the pipeline to continue processing even if individual steps fail. The procedure tracks total error count and logs the overall batch status (Success or Failed) based on whether any errors occurred.</w:t>
+        <w:t>The master SSIS package Master_Complete_Pipeline.dtsx orchestrates 49 child packages across the four layers. Each child package includes its own OnError Event Handler, allowing the pipeline to continue processing even if individual steps fail. The procedure tracks total error count and logs the overall batch status (Success or Failed) based on whether any errors occurred.</w:t>
       </w:r>
     </w:p>
     <w:p>
@@ -13407,7 +13407,7 @@
         <w:spacing w:after="60" w:line="360" w:lineRule="auto"/>
       </w:pPr>
       <w:r>
-        <w:t>Start master batch (ETL_Control.usp_StartBatch)</w:t>
+        <w:t>Start master batch (Execute SQL Task calls ETL_Control.usp_StartBatch)</w:t>
       </w:r>
     </w:p>
     <w:p>
@@ -15335,7 +15335,7 @@
           </w:tcPr>
           <w:p>
             <w:r>
-              <w:t>Stored Procedures</w:t>
+              <w:t>SSIS Packages</w:t>
             </w:r>
           </w:p>
         </w:tc>
@@ -15599,7 +15599,7 @@
         <w:jc w:val="both"/>
       </w:pPr>
       <w:r>
-        <w:t>The implemented ETL Control Framework addresses this with a comprehensive BatchLog and StepLog system [4][19]. Every procedure execution is wrapped in TRY-CATCH blocks with automatic step-level logging. The framework records batch start/end times, step-level status (Success/Failed), row counts, execution duration, and detailed error messages. When failures occur, independent steps continue processing, and the failed step can be identified and re-executed without re-running the entire pipeline.</w:t>
+        <w:t>The implemented ETL Control Framework addresses this with a comprehensive BatchLog and StepLog system [4][19]. Every SSIS child package includes OnError Event Handlers with automatic step-level logging. The framework records batch start/end times, step-level status (Success/Failed), row counts, execution duration, and detailed error messages. When failures occur, independent steps continue processing, and the failed step can be identified and re-executed without re-running the entire pipeline.</w:t>
       </w:r>
     </w:p>
     <w:p/>
@@ -16131,7 +16131,7 @@
               <w:jc w:val="center"/>
             </w:pPr>
             <w:r>
-              <w:t>BatchLog + StepLog + TRY-CATCH</w:t>
+              <w:t>BatchLog + StepLog + OnError Event Handlers</w:t>
             </w:r>
           </w:p>
         </w:tc>
@@ -16337,7 +16337,7 @@
         <w:spacing w:after="60" w:line="360" w:lineRule="auto"/>
       </w:pPr>
       <w:r>
-        <w:t>Error Isolation: The per-step TRY-CATCH pattern in the master orchestration ensured that failures in individual entities did not block processing of independent entities.</w:t>
+        <w:t>Error Isolation: The per-package OnError Event Handler pattern in the SSIS orchestration ensured that failures in individual entities did not block processing of independent entities.</w:t>
       </w:r>
     </w:p>
     <w:p>
@@ -16529,7 +16529,7 @@
         <w:jc w:val="both"/>
       </w:pPr>
       <w:r>
-        <w:t>This architecture provides three levels of scalability for business changes: (1) New attributes on existing entities require only a new Satellite table in the Bronze layer, with no impact on existing Hubs, Links, or downstream consumers. (2) New business rules or derived metrics are implemented as new Business Vault tables in the Silver layer, preserving the ability to recompute historical values from the unchanged Raw Vault. (3) New reporting dimensions or facts are added to the Gold layer independently, consuming data from either Silver or Bronze as appropriate. The 49-step ETL pipeline demonstrated in this implementation validates this modular approach: each layer operates independently with its own stored procedures, meaning a change in one layer’s business logic does not cascade into unrelated layers. This design enables the Cambodia tax system data warehouse to evolve incrementally as regulations change [13][14], without the “big bang” redesigns that characterize monolithic dimensional models.</w:t>
+        <w:t>This architecture provides three levels of scalability for business changes: (1) New attributes on existing entities require only a new Satellite table in the Bronze layer, with no impact on existing Hubs, Links, or downstream consumers. (2) New business rules or derived metrics are implemented as new Business Vault tables in the Silver layer, preserving the ability to recompute historical values from the unchanged Raw Vault. (3) New reporting dimensions or facts are added to the Gold layer independently, consuming data from either Silver or Bronze as appropriate. The 49-step ETL pipeline demonstrated in this implementation validates this modular approach: each layer operates independently with its own SSIS packages, meaning a change in one layer’s business logic does not cascade into unrelated layers. This design enables the Cambodia tax system data warehouse to evolve incrementally as regulations change [13][14], without the “big bang” redesigns that characterize monolithic dimensional models.</w:t>
       </w:r>
     </w:p>
     <w:p>
@@ -16559,7 +16559,7 @@
         <w:jc w:val="both"/>
       </w:pPr>
       <w:r>
-        <w:t>The Gold layer in this implementation materializes analytical data into physical dimension and fact tables through stored procedures executed during each ETL batch. An alternative approach available in SQL Server is the use of indexed views (SQL Server’s implementation of materialized views) [4][27], which automatically maintain pre-computed query results and are refreshed transparently by the database engine as underlying data changes.</w:t>
+        <w:t>The Gold layer in this implementation materializes analytical data into physical dimension and fact tables through SSIS Data Flow tasks executed during each ETL batch. An alternative approach available in SQL Server is the use of indexed views (SQL Server’s implementation of materialized views) [4][27], which automatically maintain pre-computed query results and are refreshed transparently by the database engine as underlying data changes.</w:t>
       </w:r>
     </w:p>
     <w:p>
@@ -17377,7 +17377,7 @@
               <w:rPr>
                 <w:sz w:val="20"/>
               </w:rPr>
-              <w:t>T-SQL (Stored Procedures, Functions, Views)</w:t>
+              <w:t>SSIS (Data Flow Tasks, Execute SQL Tasks, Event Handlers)</w:t>
             </w:r>
           </w:p>
         </w:tc>
@@ -19970,7 +19970,7 @@
         <w:jc w:val="both"/>
       </w:pPr>
       <w:r>
-        <w:t>The complete implementation comprises 9 staging tables, 24 Bronze objects (9 Hubs, 10 Satellites, 5 Links), 6 Silver objects (3 PITs, 1 Bridge, 2 Business Vault tables), 11 Gold objects (7 Dimensions, 4 Facts), and 15 stored procedures orchestrated through a master pipeline with full batch and step logging.</w:t>
+        <w:t>The complete implementation comprises 9 staging tables, 24 Bronze objects (9 Hubs, 10 Satellites, 5 Links), 6 Silver objects (3 PITs, 1 Bridge, 2 Business Vault tables), 11 Gold objects (7 Dimensions, 4 Facts), orchestrated through a master pipeline with full batch and step logging.</w:t>
       </w:r>
     </w:p>
     <w:p>

</xml_diff>

<commit_message>
Remove all remaining procedure references from Chapter 5 tables and text
</commit_message>
<xml_diff>
--- a/docs/Final_Report.docx
+++ b/docs/Final_Report.docx
@@ -1802,22 +1802,6 @@
       <w:r>
         <w:tab/>
         <w:t>(55)</w:t>
-      </w:r>
-    </w:p>
-    <w:p>
-      <w:pPr>
-        <w:tabs>
-          <w:tab w:val="right" w:leader="dot" w:pos="8306"/>
-        </w:tabs>
-        <w:spacing w:before="40" w:after="40"/>
-        <w:ind w:left="360"/>
-      </w:pPr>
-      <w:r>
-        <w:t>Appendix C: Companion Verification Documents [32][33][34]</w:t>
-      </w:r>
-      <w:r>
-        <w:tab/>
-        <w:t>(56)</w:t>
       </w:r>
     </w:p>
     <w:p>
@@ -8284,7 +8268,7 @@
         <w:spacing w:after="60" w:line="360" w:lineRule="auto"/>
       </w:pPr>
       <w:r>
-        <w:t>Batch Lifecycle: Start/End procedures that track batch execution status, duration, and record counts.</w:t>
+        <w:t>Batch Lifecycle: Start/End logging (via Execute SQL Tasks) that track batch execution status, duration, and record counts.</w:t>
       </w:r>
     </w:p>
     <w:p>
@@ -12277,7 +12261,7 @@
           </w:tcPr>
           <w:p>
             <w:r>
-              <w:t>Satellite</w:t>
+              <w:t>Hub</w:t>
             </w:r>
           </w:p>
         </w:tc>
@@ -12303,7 +12287,7 @@
             </w:pPr>
             <w:proofErr w:type="spellStart"/>
             <w:r>
-              <w:t>BRZ_SAT_Taxpayer.dtsx</w:t>
+              <w:t>BRZ_HUB_AnnualDecl.dtsx</w:t>
             </w:r>
             <w:proofErr w:type="spellEnd"/>
           </w:p>
@@ -12329,7 +12313,15 @@
               <w:jc w:val="center"/>
             </w:pPr>
             <w:r>
-              <w:t>Track taxpayer attribute changes</w:t>
+              <w:t>Load annual declaration business keys (AnnualDeclarationID)</w:t>
+            </w:r>
+            <w:proofErr w:type="spellStart"/>
+            <w:r>
+              <w:t>ActivityID</w:t>
+            </w:r>
+            <w:proofErr w:type="spellEnd"/>
+            <w:r>
+              <w:t>)</w:t>
             </w:r>
           </w:p>
         </w:tc>
@@ -12379,7 +12371,7 @@
             </w:pPr>
             <w:proofErr w:type="spellStart"/>
             <w:r>
-              <w:t>BRZ_SAT_MonthlyDecl.dtsx</w:t>
+              <w:t>BRZ_SAT_Taxpayer.dtsx</w:t>
             </w:r>
             <w:proofErr w:type="spellEnd"/>
           </w:p>
@@ -12405,7 +12397,7 @@
               <w:jc w:val="center"/>
             </w:pPr>
             <w:r>
-              <w:t>Track monthly declaration attribute changes</w:t>
+              <w:t>Track taxpayer attribute changes</w:t>
             </w:r>
           </w:p>
         </w:tc>
@@ -12455,7 +12447,7 @@
             </w:pPr>
             <w:proofErr w:type="spellStart"/>
             <w:r>
-              <w:t>BRZ_SAT_Payment.dtsx</w:t>
+              <w:t>BRZ_SAT_MonthlyDecl.dtsx</w:t>
             </w:r>
             <w:proofErr w:type="spellEnd"/>
           </w:p>
@@ -12481,7 +12473,7 @@
               <w:jc w:val="center"/>
             </w:pPr>
             <w:r>
-              <w:t>Track payment attribute changes</w:t>
+              <w:t>Track monthly declaration attribute changes</w:t>
             </w:r>
           </w:p>
         </w:tc>
@@ -12531,7 +12523,7 @@
             </w:pPr>
             <w:proofErr w:type="spellStart"/>
             <w:r>
-              <w:t>BRZ_SAT_Officer.dtsx</w:t>
+              <w:t>BRZ_SAT_Payment.dtsx</w:t>
             </w:r>
             <w:proofErr w:type="spellEnd"/>
           </w:p>
@@ -12557,7 +12549,7 @@
               <w:jc w:val="center"/>
             </w:pPr>
             <w:r>
-              <w:t>Track officer attribute changes</w:t>
+              <w:t>Track payment attribute changes</w:t>
             </w:r>
           </w:p>
         </w:tc>
@@ -12607,7 +12599,7 @@
             </w:pPr>
             <w:proofErr w:type="spellStart"/>
             <w:r>
-              <w:t>BRZ_SAT_Owner.dtsx</w:t>
+              <w:t>BRZ_SAT_Officer.dtsx</w:t>
             </w:r>
             <w:proofErr w:type="spellEnd"/>
           </w:p>
@@ -12633,7 +12625,7 @@
               <w:jc w:val="center"/>
             </w:pPr>
             <w:r>
-              <w:t>Track owner attribute changes</w:t>
+              <w:t>Track officer attribute changes</w:t>
             </w:r>
           </w:p>
         </w:tc>
@@ -12683,7 +12675,7 @@
             </w:pPr>
             <w:proofErr w:type="spellStart"/>
             <w:r>
-              <w:t>BRZ_SAT_Category.dtsx</w:t>
+              <w:t>BRZ_SAT_Owner.dtsx</w:t>
             </w:r>
             <w:proofErr w:type="spellEnd"/>
           </w:p>
@@ -12709,7 +12701,7 @@
               <w:jc w:val="center"/>
             </w:pPr>
             <w:r>
-              <w:t>Track category attribute changes</w:t>
+              <w:t>Track owner attribute changes</w:t>
             </w:r>
           </w:p>
         </w:tc>
@@ -12759,7 +12751,7 @@
             </w:pPr>
             <w:proofErr w:type="spellStart"/>
             <w:r>
-              <w:t>BRZ_SAT_Structure.dtsx</w:t>
+              <w:t>BRZ_SAT_Category.dtsx</w:t>
             </w:r>
             <w:proofErr w:type="spellEnd"/>
           </w:p>
@@ -12785,7 +12777,7 @@
               <w:jc w:val="center"/>
             </w:pPr>
             <w:r>
-              <w:t>Track structure attribute changes</w:t>
+              <w:t>Track category attribute changes</w:t>
             </w:r>
           </w:p>
         </w:tc>
@@ -12835,6 +12827,82 @@
             </w:pPr>
             <w:proofErr w:type="spellStart"/>
             <w:r>
+              <w:t>BRZ_SAT_Structure.dtsx</w:t>
+            </w:r>
+            <w:proofErr w:type="spellEnd"/>
+          </w:p>
+        </w:tc>
+        <w:tc>
+          <w:tcPr>
+            <w:tcW w:w="3239" w:type="dxa"/>
+            <w:tcBorders>
+              <w:top w:val="single" w:sz="1" w:space="0" w:color="000000"/>
+              <w:left w:val="single" w:sz="1" w:space="0" w:color="000000"/>
+              <w:bottom w:val="single" w:sz="1" w:space="0" w:color="000000"/>
+              <w:right w:val="single" w:sz="1" w:space="0" w:color="000000"/>
+            </w:tcBorders>
+            <w:tcMar>
+              <w:top w:w="60" w:type="dxa"/>
+              <w:left w:w="100" w:type="dxa"/>
+              <w:bottom w:w="60" w:type="dxa"/>
+              <w:right w:w="100" w:type="dxa"/>
+            </w:tcMar>
+          </w:tcPr>
+          <w:p>
+            <w:pPr>
+              <w:jc w:val="center"/>
+            </w:pPr>
+            <w:r>
+              <w:t>Track structure attribute changes</w:t>
+            </w:r>
+          </w:p>
+        </w:tc>
+      </w:tr>
+      <w:tr>
+        <w:tc>
+          <w:tcPr>
+            <w:tcW w:w="1141" w:type="dxa"/>
+            <w:tcBorders>
+              <w:top w:val="single" w:sz="1" w:space="0" w:color="000000"/>
+              <w:left w:val="single" w:sz="1" w:space="0" w:color="000000"/>
+              <w:bottom w:val="single" w:sz="1" w:space="0" w:color="000000"/>
+              <w:right w:val="single" w:sz="1" w:space="0" w:color="000000"/>
+            </w:tcBorders>
+            <w:tcMar>
+              <w:top w:w="60" w:type="dxa"/>
+              <w:left w:w="100" w:type="dxa"/>
+              <w:bottom w:w="60" w:type="dxa"/>
+              <w:right w:w="100" w:type="dxa"/>
+            </w:tcMar>
+          </w:tcPr>
+          <w:p>
+            <w:r>
+              <w:t>Satellite</w:t>
+            </w:r>
+          </w:p>
+        </w:tc>
+        <w:tc>
+          <w:tcPr>
+            <w:tcW w:w="3926" w:type="dxa"/>
+            <w:tcBorders>
+              <w:top w:val="single" w:sz="1" w:space="0" w:color="000000"/>
+              <w:left w:val="single" w:sz="1" w:space="0" w:color="000000"/>
+              <w:bottom w:val="single" w:sz="1" w:space="0" w:color="000000"/>
+              <w:right w:val="single" w:sz="1" w:space="0" w:color="000000"/>
+            </w:tcBorders>
+            <w:tcMar>
+              <w:top w:w="60" w:type="dxa"/>
+              <w:left w:w="100" w:type="dxa"/>
+              <w:bottom w:w="60" w:type="dxa"/>
+              <w:right w:w="100" w:type="dxa"/>
+            </w:tcMar>
+          </w:tcPr>
+          <w:p>
+            <w:pPr>
+              <w:jc w:val="center"/>
+            </w:pPr>
+            <w:proofErr w:type="spellStart"/>
+            <w:r>
               <w:t>BRZ_SAT_Activity.dtsx</w:t>
             </w:r>
             <w:proofErr w:type="spellEnd"/>
@@ -12862,6 +12930,82 @@
             </w:pPr>
             <w:r>
               <w:t>Track activity attribute changes</w:t>
+            </w:r>
+          </w:p>
+        </w:tc>
+      </w:tr>
+      <w:tr>
+        <w:tc>
+          <w:tcPr>
+            <w:tcW w:w="1141" w:type="dxa"/>
+            <w:tcBorders>
+              <w:top w:val="single" w:sz="1" w:space="0" w:color="000000"/>
+              <w:left w:val="single" w:sz="1" w:space="0" w:color="000000"/>
+              <w:bottom w:val="single" w:sz="1" w:space="0" w:color="000000"/>
+              <w:right w:val="single" w:sz="1" w:space="0" w:color="000000"/>
+            </w:tcBorders>
+            <w:tcMar>
+              <w:top w:w="60" w:type="dxa"/>
+              <w:left w:w="100" w:type="dxa"/>
+              <w:bottom w:w="60" w:type="dxa"/>
+              <w:right w:w="100" w:type="dxa"/>
+            </w:tcMar>
+          </w:tcPr>
+          <w:p>
+            <w:r>
+              <w:t>Satellite</w:t>
+            </w:r>
+          </w:p>
+        </w:tc>
+        <w:tc>
+          <w:tcPr>
+            <w:tcW w:w="3926" w:type="dxa"/>
+            <w:tcBorders>
+              <w:top w:val="single" w:sz="1" w:space="0" w:color="000000"/>
+              <w:left w:val="single" w:sz="1" w:space="0" w:color="000000"/>
+              <w:bottom w:val="single" w:sz="1" w:space="0" w:color="000000"/>
+              <w:right w:val="single" w:sz="1" w:space="0" w:color="000000"/>
+            </w:tcBorders>
+            <w:tcMar>
+              <w:top w:w="60" w:type="dxa"/>
+              <w:left w:w="100" w:type="dxa"/>
+              <w:bottom w:w="60" w:type="dxa"/>
+              <w:right w:w="100" w:type="dxa"/>
+            </w:tcMar>
+          </w:tcPr>
+          <w:p>
+            <w:pPr>
+              <w:jc w:val="center"/>
+            </w:pPr>
+            <w:proofErr w:type="spellStart"/>
+            <w:r>
+              <w:t>BRZ_SAT_AnnualDecl.dtsx</w:t>
+            </w:r>
+            <w:proofErr w:type="spellEnd"/>
+          </w:p>
+        </w:tc>
+        <w:tc>
+          <w:tcPr>
+            <w:tcW w:w="3239" w:type="dxa"/>
+            <w:tcBorders>
+              <w:top w:val="single" w:sz="1" w:space="0" w:color="000000"/>
+              <w:left w:val="single" w:sz="1" w:space="0" w:color="000000"/>
+              <w:bottom w:val="single" w:sz="1" w:space="0" w:color="000000"/>
+              <w:right w:val="single" w:sz="1" w:space="0" w:color="000000"/>
+            </w:tcBorders>
+            <w:tcMar>
+              <w:top w:w="60" w:type="dxa"/>
+              <w:left w:w="100" w:type="dxa"/>
+              <w:bottom w:w="60" w:type="dxa"/>
+              <w:right w:w="100" w:type="dxa"/>
+            </w:tcMar>
+          </w:tcPr>
+          <w:p>
+            <w:pPr>
+              <w:jc w:val="center"/>
+            </w:pPr>
+            <w:r>
+              <w:t>Track annual declaration attribute changes</w:t>
             </w:r>
           </w:p>
         </w:tc>
@@ -13349,7 +13493,7 @@
         <w:jc w:val="both"/>
       </w:pPr>
       <w:r>
-        <w:t>Three PIT procedures create daily snapshots by cross-applying the latest active Satellite record for each Hub at the specified snapshot date. This pre-computation eliminates the complex temporal joins that would otherwise be required to query satellite data as-of a specific date.</w:t>
+        <w:t>Three PIT SSIS packages create daily snapshots by cross-applying the latest active Satellite record for each Hub at the specified snapshot date. This pre-computation eliminates the complex temporal joins that would otherwise be required to query satellite data as-of a specific date.</w:t>
       </w:r>
     </w:p>
     <w:p>
@@ -13608,7 +13752,7 @@
             </w:pPr>
             <w:proofErr w:type="spellStart"/>
             <w:r>
-              <w:t>SLV_Load_PIT_Taxpayer.dtsx</w:t>
+              <w:t>SLV_PIT_Taxpayer.dtsx</w:t>
             </w:r>
             <w:proofErr w:type="spellEnd"/>
           </w:p>
@@ -13684,7 +13828,7 @@
             </w:pPr>
             <w:proofErr w:type="spellStart"/>
             <w:r>
-              <w:t>SLV_Load_PIT_Declaration.dtsx</w:t>
+              <w:t>SLV_PIT_Declaration.dtsx</w:t>
             </w:r>
             <w:proofErr w:type="spellEnd"/>
           </w:p>
@@ -13760,7 +13904,7 @@
             </w:pPr>
             <w:proofErr w:type="spellStart"/>
             <w:r>
-              <w:t>SLV_Load_PIT_Payment.dtsx</w:t>
+              <w:t>SLV_PIT_Payment.dtsx</w:t>
             </w:r>
             <w:proofErr w:type="spellEnd"/>
           </w:p>
@@ -13837,7 +13981,7 @@
             </w:pPr>
             <w:proofErr w:type="spellStart"/>
             <w:r>
-              <w:t>SLV_Load_BRG_TaxpayerOwner.dtsx</w:t>
+              <w:t>SLV_BRG_Taxpayer_Owner.dtsx</w:t>
             </w:r>
             <w:proofErr w:type="spellEnd"/>
           </w:p>
@@ -13913,7 +14057,7 @@
             </w:pPr>
             <w:proofErr w:type="spellStart"/>
             <w:r>
-              <w:t>SLV_Load_BUS_ComplianceScore.dtsx</w:t>
+              <w:t>SLV_BUS_ComplianceScore.dtsx</w:t>
             </w:r>
             <w:proofErr w:type="spellEnd"/>
           </w:p>
@@ -13989,7 +14133,7 @@
             </w:pPr>
             <w:proofErr w:type="spellStart"/>
             <w:r>
-              <w:t>SLV_Load_BUS_MonthlyMetrics.dtsx</w:t>
+              <w:t>SLV_BUS_MonthlyMetrics.dtsx</w:t>
             </w:r>
             <w:proofErr w:type="spellEnd"/>
           </w:p>
@@ -14103,7 +14247,7 @@
       </w:r>
       <w:proofErr w:type="spellEnd"/>
       <w:r>
-        <w:t xml:space="preserve"> is populated using a date generation procedure that creates records for a configurable range of years with attributes including day of week, month name, quarter, fiscal year, and holiday flags.</w:t>
+        <w:t xml:space="preserve"> is populated using a date generation script that creates records for a configurable range of years with attributes including day of week, month name, quarter, fiscal year, and holiday flags.</w:t>
       </w:r>
     </w:p>
     <w:p>
@@ -14168,7 +14312,7 @@
           <w:b/>
           <w:bCs/>
         </w:rPr>
-        <w:t>Procedures Implemented</w:t>
+        <w:t>SSIS Packages Implemented</w:t>
       </w:r>
     </w:p>
     <w:p/>
@@ -14327,7 +14471,7 @@
           </w:tcPr>
           <w:p>
             <w:r>
-              <w:t>GLD_Load_DIM_Taxpayer_SCD2.dtsx</w:t>
+              <w:t>GLD_DIM_Taxpayer.dtsx</w:t>
             </w:r>
           </w:p>
         </w:tc>
@@ -14398,7 +14542,7 @@
           </w:tcPr>
           <w:p>
             <w:r>
-              <w:t>GLD_Load_DIM_Officer_SCD2.dtsx</w:t>
+              <w:t>GLD_DIM_Officer.dtsx</w:t>
             </w:r>
           </w:p>
         </w:tc>
@@ -14470,7 +14614,7 @@
           <w:p>
             <w:proofErr w:type="spellStart"/>
             <w:r>
-              <w:t>GLD_Load_DIM_Category.dtsx</w:t>
+              <w:t>GLD_DIM_Category.dtsx</w:t>
             </w:r>
             <w:proofErr w:type="spellEnd"/>
           </w:p>
@@ -14543,7 +14687,7 @@
           <w:p>
             <w:proofErr w:type="spellStart"/>
             <w:r>
-              <w:t>GLD_Load_DIM_PaymentMethod.dtsx</w:t>
+              <w:t>GLD_DIM_PaymentMethod.dtsx</w:t>
             </w:r>
             <w:proofErr w:type="spellEnd"/>
           </w:p>
@@ -14616,7 +14760,7 @@
           <w:p>
             <w:proofErr w:type="spellStart"/>
             <w:r>
-              <w:t>GLD_Load_DIM_Activity.dtsx</w:t>
+              <w:t>GLD_DIM_Activity.dtsx</w:t>
             </w:r>
             <w:proofErr w:type="spellEnd"/>
           </w:p>
@@ -14689,7 +14833,7 @@
           <w:p>
             <w:proofErr w:type="spellStart"/>
             <w:r>
-              <w:t>GLD_Load_DIM_Structure.dtsx</w:t>
+              <w:t>GLD_DIM_Structure.dtsx</w:t>
             </w:r>
             <w:proofErr w:type="spellEnd"/>
           </w:p>
@@ -14762,7 +14906,7 @@
           <w:p>
             <w:proofErr w:type="spellStart"/>
             <w:r>
-              <w:t>GLD_Load_DIM_Status.dtsx</w:t>
+              <w:t>GLD_DIM_Status.dtsx</w:t>
             </w:r>
             <w:proofErr w:type="spellEnd"/>
           </w:p>
@@ -14812,8 +14956,7 @@
           </w:tcPr>
           <w:p>
             <w:r>
-              <w:lastRenderedPageBreak/>
-              <w:t>Dimension</w:t>
+              <w:t>Fact</w:t>
             </w:r>
           </w:p>
         </w:tc>
@@ -14836,7 +14979,7 @@
           <w:p>
             <w:proofErr w:type="spellStart"/>
             <w:r>
-              <w:t>GLD_Populate_DIM_Date.dtsx</w:t>
+              <w:t>GLD_FACT_MonthlyDeclaration.dtsx</w:t>
             </w:r>
             <w:proofErr w:type="spellEnd"/>
           </w:p>
@@ -14862,7 +15005,7 @@
               <w:jc w:val="center"/>
             </w:pPr>
             <w:r>
-              <w:t>Static</w:t>
+              <w:t>-</w:t>
             </w:r>
           </w:p>
         </w:tc>
@@ -14909,7 +15052,7 @@
           <w:p>
             <w:proofErr w:type="spellStart"/>
             <w:r>
-              <w:t>GLD_Load_FACT_MonthlyDeclaration.dtsx</w:t>
+              <w:t>GLD_FACT_Payment.dtsx</w:t>
             </w:r>
             <w:proofErr w:type="spellEnd"/>
           </w:p>
@@ -14982,7 +15125,7 @@
           <w:p>
             <w:proofErr w:type="spellStart"/>
             <w:r>
-              <w:t>GLD_Load_FACT_Payment.dtsx</w:t>
+              <w:t>GLD_FACT_MonthlySnapshot.dtsx</w:t>
             </w:r>
             <w:proofErr w:type="spellEnd"/>
           </w:p>
@@ -15055,80 +15198,7 @@
           <w:p>
             <w:proofErr w:type="spellStart"/>
             <w:r>
-              <w:t>GLD_Load_FACT_MonthlySnapshot.dtsx</w:t>
-            </w:r>
-            <w:proofErr w:type="spellEnd"/>
-          </w:p>
-        </w:tc>
-        <w:tc>
-          <w:tcPr>
-            <w:tcW w:w="2906" w:type="dxa"/>
-            <w:tcBorders>
-              <w:top w:val="single" w:sz="1" w:space="0" w:color="000000"/>
-              <w:left w:val="single" w:sz="1" w:space="0" w:color="000000"/>
-              <w:bottom w:val="single" w:sz="1" w:space="0" w:color="000000"/>
-              <w:right w:val="single" w:sz="1" w:space="0" w:color="000000"/>
-            </w:tcBorders>
-            <w:tcMar>
-              <w:top w:w="60" w:type="dxa"/>
-              <w:left w:w="100" w:type="dxa"/>
-              <w:bottom w:w="60" w:type="dxa"/>
-              <w:right w:w="100" w:type="dxa"/>
-            </w:tcMar>
-          </w:tcPr>
-          <w:p>
-            <w:pPr>
-              <w:jc w:val="center"/>
-            </w:pPr>
-            <w:r>
-              <w:t>-</w:t>
-            </w:r>
-          </w:p>
-        </w:tc>
-      </w:tr>
-      <w:tr>
-        <w:tc>
-          <w:tcPr>
-            <w:tcW w:w="1600" w:type="dxa"/>
-            <w:tcBorders>
-              <w:top w:val="single" w:sz="1" w:space="0" w:color="000000"/>
-              <w:left w:val="single" w:sz="1" w:space="0" w:color="000000"/>
-              <w:bottom w:val="single" w:sz="1" w:space="0" w:color="000000"/>
-              <w:right w:val="single" w:sz="1" w:space="0" w:color="000000"/>
-            </w:tcBorders>
-            <w:tcMar>
-              <w:top w:w="60" w:type="dxa"/>
-              <w:left w:w="100" w:type="dxa"/>
-              <w:bottom w:w="60" w:type="dxa"/>
-              <w:right w:w="100" w:type="dxa"/>
-            </w:tcMar>
-          </w:tcPr>
-          <w:p>
-            <w:r>
-              <w:t>Fact</w:t>
-            </w:r>
-          </w:p>
-        </w:tc>
-        <w:tc>
-          <w:tcPr>
-            <w:tcW w:w="3800" w:type="dxa"/>
-            <w:tcBorders>
-              <w:top w:val="single" w:sz="1" w:space="0" w:color="000000"/>
-              <w:left w:val="single" w:sz="1" w:space="0" w:color="000000"/>
-              <w:bottom w:val="single" w:sz="1" w:space="0" w:color="000000"/>
-              <w:right w:val="single" w:sz="1" w:space="0" w:color="000000"/>
-            </w:tcBorders>
-            <w:tcMar>
-              <w:top w:w="60" w:type="dxa"/>
-              <w:left w:w="100" w:type="dxa"/>
-              <w:bottom w:w="60" w:type="dxa"/>
-              <w:right w:w="100" w:type="dxa"/>
-            </w:tcMar>
-          </w:tcPr>
-          <w:p>
-            <w:proofErr w:type="spellStart"/>
-            <w:r>
-              <w:t>GLD_Load_FACT_DeclarationLifecycle.dtsx</w:t>
+              <w:t>GLD_FACT_DeclarationLifecycle.dtsx</w:t>
             </w:r>
             <w:proofErr w:type="spellEnd"/>
           </w:p>
@@ -15614,7 +15684,7 @@
                 <w:b/>
                 <w:bCs/>
               </w:rPr>
-              <w:t>Procedures</w:t>
+              <w:t>SSIS Packages</w:t>
             </w:r>
           </w:p>
         </w:tc>
@@ -15718,7 +15788,7 @@
               <w:jc w:val="center"/>
             </w:pPr>
             <w:r>
-              <w:t>9 + 1 master</w:t>
+              <w:t>9 + 1 orchestrator</w:t>
             </w:r>
           </w:p>
         </w:tc>
@@ -15817,7 +15887,7 @@
               <w:jc w:val="center"/>
             </w:pPr>
             <w:r>
-              <w:t>21 + 1 master</w:t>
+              <w:t>21 + 1 orchestrator</w:t>
             </w:r>
           </w:p>
         </w:tc>
@@ -18517,7 +18587,7 @@
         <w:spacing w:after="60" w:line="360" w:lineRule="auto"/>
       </w:pPr>
       <w:r>
-        <w:t>Always implement ETL control frameworks with batch/step logging before building data loading procedures.</w:t>
+        <w:t>Always implement ETL control frameworks with batch/step logging before building data loading SSIS packages.</w:t>
       </w:r>
     </w:p>
     <w:p>
@@ -23894,376 +23964,6 @@
           </w:p>
         </w:tc>
       </w:tr>
-      <w:tr>
-        <w:tc>
-          <w:tcPr>
-            <w:tcW w:w="3000" w:type="dxa"/>
-            <w:tcBorders>
-              <w:top w:val="single" w:sz="1" w:space="0" w:color="000000"/>
-              <w:left w:val="single" w:sz="1" w:space="0" w:color="000000"/>
-              <w:bottom w:val="single" w:sz="1" w:space="0" w:color="000000"/>
-              <w:right w:val="single" w:sz="1" w:space="0" w:color="000000"/>
-            </w:tcBorders>
-            <w:tcMar>
-              <w:top w:w="60" w:type="dxa"/>
-              <w:left w:w="100" w:type="dxa"/>
-              <w:bottom w:w="60" w:type="dxa"/>
-              <w:right w:w="100" w:type="dxa"/>
-            </w:tcMar>
-          </w:tcPr>
-          <w:p>
-            <w:r>
-              <w:t>05_ETL_Staging_Procedures.sql</w:t>
-            </w:r>
-          </w:p>
-        </w:tc>
-        <w:tc>
-          <w:tcPr>
-            <w:tcW w:w="4106" w:type="dxa"/>
-            <w:tcBorders>
-              <w:top w:val="single" w:sz="1" w:space="0" w:color="000000"/>
-              <w:left w:val="single" w:sz="1" w:space="0" w:color="000000"/>
-              <w:bottom w:val="single" w:sz="1" w:space="0" w:color="000000"/>
-              <w:right w:val="single" w:sz="1" w:space="0" w:color="000000"/>
-            </w:tcBorders>
-            <w:tcMar>
-              <w:top w:w="60" w:type="dxa"/>
-              <w:left w:w="100" w:type="dxa"/>
-              <w:bottom w:w="60" w:type="dxa"/>
-              <w:right w:w="100" w:type="dxa"/>
-            </w:tcMar>
-          </w:tcPr>
-          <w:p>
-            <w:pPr>
-              <w:jc w:val="center"/>
-            </w:pPr>
-            <w:r>
-              <w:t>Staging helper procedures (truncate, validate, row count)</w:t>
-            </w:r>
-          </w:p>
-        </w:tc>
-        <w:tc>
-          <w:tcPr>
-            <w:tcW w:w="1200" w:type="dxa"/>
-            <w:tcBorders>
-              <w:top w:val="single" w:sz="1" w:space="0" w:color="000000"/>
-              <w:left w:val="single" w:sz="1" w:space="0" w:color="000000"/>
-              <w:bottom w:val="single" w:sz="1" w:space="0" w:color="000000"/>
-              <w:right w:val="single" w:sz="1" w:space="0" w:color="000000"/>
-            </w:tcBorders>
-            <w:tcMar>
-              <w:top w:w="60" w:type="dxa"/>
-              <w:left w:w="100" w:type="dxa"/>
-              <w:bottom w:w="60" w:type="dxa"/>
-              <w:right w:w="100" w:type="dxa"/>
-            </w:tcMar>
-          </w:tcPr>
-          <w:p>
-            <w:pPr>
-              <w:jc w:val="center"/>
-            </w:pPr>
-            <w:r>
-              <w:t>~1,216</w:t>
-            </w:r>
-          </w:p>
-        </w:tc>
-      </w:tr>
-      <w:tr>
-        <w:tc>
-          <w:tcPr>
-            <w:tcW w:w="3000" w:type="dxa"/>
-            <w:tcBorders>
-              <w:top w:val="single" w:sz="1" w:space="0" w:color="000000"/>
-              <w:left w:val="single" w:sz="1" w:space="0" w:color="000000"/>
-              <w:bottom w:val="single" w:sz="1" w:space="0" w:color="000000"/>
-              <w:right w:val="single" w:sz="1" w:space="0" w:color="000000"/>
-            </w:tcBorders>
-            <w:tcMar>
-              <w:top w:w="60" w:type="dxa"/>
-              <w:left w:w="100" w:type="dxa"/>
-              <w:bottom w:w="60" w:type="dxa"/>
-              <w:right w:w="100" w:type="dxa"/>
-            </w:tcMar>
-          </w:tcPr>
-          <w:p>
-            <w:r>
-              <w:t>06_ETL_Bronze_Procedures.sql</w:t>
-            </w:r>
-          </w:p>
-        </w:tc>
-        <w:tc>
-          <w:tcPr>
-            <w:tcW w:w="4106" w:type="dxa"/>
-            <w:tcBorders>
-              <w:top w:val="single" w:sz="1" w:space="0" w:color="000000"/>
-              <w:left w:val="single" w:sz="1" w:space="0" w:color="000000"/>
-              <w:bottom w:val="single" w:sz="1" w:space="0" w:color="000000"/>
-              <w:right w:val="single" w:sz="1" w:space="0" w:color="000000"/>
-            </w:tcBorders>
-            <w:tcMar>
-              <w:top w:w="60" w:type="dxa"/>
-              <w:left w:w="100" w:type="dxa"/>
-              <w:bottom w:w="60" w:type="dxa"/>
-              <w:right w:w="100" w:type="dxa"/>
-            </w:tcMar>
-          </w:tcPr>
-          <w:p>
-            <w:pPr>
-              <w:jc w:val="center"/>
-            </w:pPr>
-            <w:r>
-              <w:t>SSIS DFT implementation notes (Bronze layer)</w:t>
-            </w:r>
-          </w:p>
-        </w:tc>
-        <w:tc>
-          <w:tcPr>
-            <w:tcW w:w="1200" w:type="dxa"/>
-            <w:tcBorders>
-              <w:top w:val="single" w:sz="1" w:space="0" w:color="000000"/>
-              <w:left w:val="single" w:sz="1" w:space="0" w:color="000000"/>
-              <w:bottom w:val="single" w:sz="1" w:space="0" w:color="000000"/>
-              <w:right w:val="single" w:sz="1" w:space="0" w:color="000000"/>
-            </w:tcBorders>
-            <w:tcMar>
-              <w:top w:w="60" w:type="dxa"/>
-              <w:left w:w="100" w:type="dxa"/>
-              <w:bottom w:w="60" w:type="dxa"/>
-              <w:right w:w="100" w:type="dxa"/>
-            </w:tcMar>
-          </w:tcPr>
-          <w:p>
-            <w:pPr>
-              <w:jc w:val="center"/>
-            </w:pPr>
-            <w:r>
-              <w:t>~1,646</w:t>
-            </w:r>
-          </w:p>
-        </w:tc>
-      </w:tr>
-      <w:tr>
-        <w:tc>
-          <w:tcPr>
-            <w:tcW w:w="3000" w:type="dxa"/>
-            <w:tcBorders>
-              <w:top w:val="single" w:sz="1" w:space="0" w:color="000000"/>
-              <w:left w:val="single" w:sz="1" w:space="0" w:color="000000"/>
-              <w:bottom w:val="single" w:sz="1" w:space="0" w:color="000000"/>
-              <w:right w:val="single" w:sz="1" w:space="0" w:color="000000"/>
-            </w:tcBorders>
-            <w:tcMar>
-              <w:top w:w="60" w:type="dxa"/>
-              <w:left w:w="100" w:type="dxa"/>
-              <w:bottom w:w="60" w:type="dxa"/>
-              <w:right w:w="100" w:type="dxa"/>
-            </w:tcMar>
-          </w:tcPr>
-          <w:p>
-            <w:r>
-              <w:t>07_ETL_Silver_Procedures.sql</w:t>
-            </w:r>
-          </w:p>
-        </w:tc>
-        <w:tc>
-          <w:tcPr>
-            <w:tcW w:w="4106" w:type="dxa"/>
-            <w:tcBorders>
-              <w:top w:val="single" w:sz="1" w:space="0" w:color="000000"/>
-              <w:left w:val="single" w:sz="1" w:space="0" w:color="000000"/>
-              <w:bottom w:val="single" w:sz="1" w:space="0" w:color="000000"/>
-              <w:right w:val="single" w:sz="1" w:space="0" w:color="000000"/>
-            </w:tcBorders>
-            <w:tcMar>
-              <w:top w:w="60" w:type="dxa"/>
-              <w:left w:w="100" w:type="dxa"/>
-              <w:bottom w:w="60" w:type="dxa"/>
-              <w:right w:w="100" w:type="dxa"/>
-            </w:tcMar>
-          </w:tcPr>
-          <w:p>
-            <w:pPr>
-              <w:jc w:val="center"/>
-            </w:pPr>
-            <w:r>
-              <w:t>SSIS DFT implementation notes (Silver layer)</w:t>
-            </w:r>
-          </w:p>
-        </w:tc>
-        <w:tc>
-          <w:tcPr>
-            <w:tcW w:w="1200" w:type="dxa"/>
-            <w:tcBorders>
-              <w:top w:val="single" w:sz="1" w:space="0" w:color="000000"/>
-              <w:left w:val="single" w:sz="1" w:space="0" w:color="000000"/>
-              <w:bottom w:val="single" w:sz="1" w:space="0" w:color="000000"/>
-              <w:right w:val="single" w:sz="1" w:space="0" w:color="000000"/>
-            </w:tcBorders>
-            <w:tcMar>
-              <w:top w:w="60" w:type="dxa"/>
-              <w:left w:w="100" w:type="dxa"/>
-              <w:bottom w:w="60" w:type="dxa"/>
-              <w:right w:w="100" w:type="dxa"/>
-            </w:tcMar>
-          </w:tcPr>
-          <w:p>
-            <w:pPr>
-              <w:jc w:val="center"/>
-            </w:pPr>
-            <w:r>
-              <w:t>~474</w:t>
-            </w:r>
-          </w:p>
-        </w:tc>
-      </w:tr>
-      <w:tr>
-        <w:tc>
-          <w:tcPr>
-            <w:tcW w:w="3000" w:type="dxa"/>
-            <w:tcBorders>
-              <w:top w:val="single" w:sz="1" w:space="0" w:color="000000"/>
-              <w:left w:val="single" w:sz="1" w:space="0" w:color="000000"/>
-              <w:bottom w:val="single" w:sz="1" w:space="0" w:color="000000"/>
-              <w:right w:val="single" w:sz="1" w:space="0" w:color="000000"/>
-            </w:tcBorders>
-            <w:tcMar>
-              <w:top w:w="60" w:type="dxa"/>
-              <w:left w:w="100" w:type="dxa"/>
-              <w:bottom w:w="60" w:type="dxa"/>
-              <w:right w:w="100" w:type="dxa"/>
-            </w:tcMar>
-          </w:tcPr>
-          <w:p>
-            <w:r>
-              <w:t>08_ETL_Gold_Procedures.sql</w:t>
-            </w:r>
-          </w:p>
-        </w:tc>
-        <w:tc>
-          <w:tcPr>
-            <w:tcW w:w="4106" w:type="dxa"/>
-            <w:tcBorders>
-              <w:top w:val="single" w:sz="1" w:space="0" w:color="000000"/>
-              <w:left w:val="single" w:sz="1" w:space="0" w:color="000000"/>
-              <w:bottom w:val="single" w:sz="1" w:space="0" w:color="000000"/>
-              <w:right w:val="single" w:sz="1" w:space="0" w:color="000000"/>
-            </w:tcBorders>
-            <w:tcMar>
-              <w:top w:w="60" w:type="dxa"/>
-              <w:left w:w="100" w:type="dxa"/>
-              <w:bottom w:w="60" w:type="dxa"/>
-              <w:right w:w="100" w:type="dxa"/>
-            </w:tcMar>
-          </w:tcPr>
-          <w:p>
-            <w:pPr>
-              <w:jc w:val="center"/>
-            </w:pPr>
-            <w:r>
-              <w:t>SSIS DFT implementation notes (Gold layer)</w:t>
-            </w:r>
-          </w:p>
-        </w:tc>
-        <w:tc>
-          <w:tcPr>
-            <w:tcW w:w="1200" w:type="dxa"/>
-            <w:tcBorders>
-              <w:top w:val="single" w:sz="1" w:space="0" w:color="000000"/>
-              <w:left w:val="single" w:sz="1" w:space="0" w:color="000000"/>
-              <w:bottom w:val="single" w:sz="1" w:space="0" w:color="000000"/>
-              <w:right w:val="single" w:sz="1" w:space="0" w:color="000000"/>
-            </w:tcBorders>
-            <w:tcMar>
-              <w:top w:w="60" w:type="dxa"/>
-              <w:left w:w="100" w:type="dxa"/>
-              <w:bottom w:w="60" w:type="dxa"/>
-              <w:right w:w="100" w:type="dxa"/>
-            </w:tcMar>
-          </w:tcPr>
-          <w:p>
-            <w:pPr>
-              <w:jc w:val="center"/>
-            </w:pPr>
-            <w:r>
-              <w:t>~802</w:t>
-            </w:r>
-          </w:p>
-        </w:tc>
-      </w:tr>
-      <w:tr>
-        <w:tc>
-          <w:tcPr>
-            <w:tcW w:w="3000" w:type="dxa"/>
-            <w:tcBorders>
-              <w:top w:val="single" w:sz="1" w:space="0" w:color="000000"/>
-              <w:left w:val="single" w:sz="1" w:space="0" w:color="000000"/>
-              <w:bottom w:val="single" w:sz="1" w:space="0" w:color="000000"/>
-              <w:right w:val="single" w:sz="1" w:space="0" w:color="000000"/>
-            </w:tcBorders>
-            <w:tcMar>
-              <w:top w:w="60" w:type="dxa"/>
-              <w:left w:w="100" w:type="dxa"/>
-              <w:bottom w:w="60" w:type="dxa"/>
-              <w:right w:w="100" w:type="dxa"/>
-            </w:tcMar>
-          </w:tcPr>
-          <w:p>
-            <w:r>
-              <w:t>09_ETL_Master_Orchestration.sql</w:t>
-            </w:r>
-          </w:p>
-        </w:tc>
-        <w:tc>
-          <w:tcPr>
-            <w:tcW w:w="4106" w:type="dxa"/>
-            <w:tcBorders>
-              <w:top w:val="single" w:sz="1" w:space="0" w:color="000000"/>
-              <w:left w:val="single" w:sz="1" w:space="0" w:color="000000"/>
-              <w:bottom w:val="single" w:sz="1" w:space="0" w:color="000000"/>
-              <w:right w:val="single" w:sz="1" w:space="0" w:color="000000"/>
-            </w:tcBorders>
-            <w:tcMar>
-              <w:top w:w="60" w:type="dxa"/>
-              <w:left w:w="100" w:type="dxa"/>
-              <w:bottom w:w="60" w:type="dxa"/>
-              <w:right w:w="100" w:type="dxa"/>
-            </w:tcMar>
-          </w:tcPr>
-          <w:p>
-            <w:pPr>
-              <w:jc w:val="center"/>
-            </w:pPr>
-            <w:r>
-              <w:t>Master pipeline orchestration SSIS package</w:t>
-            </w:r>
-          </w:p>
-        </w:tc>
-        <w:tc>
-          <w:tcPr>
-            <w:tcW w:w="1200" w:type="dxa"/>
-            <w:tcBorders>
-              <w:top w:val="single" w:sz="1" w:space="0" w:color="000000"/>
-              <w:left w:val="single" w:sz="1" w:space="0" w:color="000000"/>
-              <w:bottom w:val="single" w:sz="1" w:space="0" w:color="000000"/>
-              <w:right w:val="single" w:sz="1" w:space="0" w:color="000000"/>
-            </w:tcBorders>
-            <w:tcMar>
-              <w:top w:w="60" w:type="dxa"/>
-              <w:left w:w="100" w:type="dxa"/>
-              <w:bottom w:w="60" w:type="dxa"/>
-              <w:right w:w="100" w:type="dxa"/>
-            </w:tcMar>
-          </w:tcPr>
-          <w:p>
-            <w:pPr>
-              <w:jc w:val="center"/>
-            </w:pPr>
-            <w:r>
-              <w:t>~604</w:t>
-            </w:r>
-          </w:p>
-        </w:tc>
-      </w:tr>
     </w:tbl>
     <w:p/>
     <w:p>
@@ -25250,116 +24950,6 @@
       </w:tr>
     </w:tbl>
     <w:p/>
-    <w:p>
-      <w:pPr>
-        <w:pStyle w:val="Heading2"/>
-      </w:pPr>
-      <w:r>
-        <w:t>Appendix C: Companion Verification Documents</w:t>
-      </w:r>
-    </w:p>
-    <w:p>
-      <w:pPr>
-        <w:spacing w:after="120" w:line="360" w:lineRule="auto"/>
-        <w:jc w:val="both"/>
-      </w:pPr>
-      <w:r>
-        <w:t>The following companion documents provide step-by-step verification evidence with SQL scripts and SSMS screenshots. These documents are submitted alongside this report to enable independent reproducibility of all benchmark and scenario results.</w:t>
-      </w:r>
-    </w:p>
-    <w:p>
-      <w:pPr>
-        <w:spacing w:after="120" w:line="360" w:lineRule="auto"/>
-        <w:jc w:val="both"/>
-      </w:pPr>
-      <w:r>
-        <w:rPr>
-          <w:b/>
-        </w:rPr>
-        <w:t xml:space="preserve">[32] Implementation Scenarios (13 pages): </w:t>
-      </w:r>
-      <w:r>
-        <w:t xml:space="preserve">Companion to Sections 5.2.5, 5.2.6, and 5.2.7. Contains step-by-step SQL scripts and 12 embedded SSMS screenshots verifying three scenarios: (1) Flexibility — </w:t>
-      </w:r>
-      <w:proofErr w:type="spellStart"/>
-      <w:r>
-        <w:t>SAT_Taxpayer_RiskLevel</w:t>
-      </w:r>
-      <w:proofErr w:type="spellEnd"/>
-      <w:r>
-        <w:t xml:space="preserve"> addition with 23/23 existing objects verified unchanged; (2) Materialized Views — </w:t>
-      </w:r>
-      <w:proofErr w:type="spellStart"/>
-      <w:r>
-        <w:t>vw_GoldMonthlyRevenue</w:t>
-      </w:r>
-      <w:proofErr w:type="spellEnd"/>
-      <w:r>
-        <w:t xml:space="preserve"> indexed view with verified 2.1x speedup (73ms → 34ms); (3) Early Arriving Facts — TAX-2026-EARLY test case with 4-step chronological timeline (263-second Hub-to-Satellite delay, zero UPDATEs). Includes </w:t>
-      </w:r>
-      <w:proofErr w:type="spellStart"/>
-      <w:r>
-        <w:t>Verify_Implementation_Scenarios.sql</w:t>
-      </w:r>
-      <w:proofErr w:type="spellEnd"/>
-      <w:r>
-        <w:t xml:space="preserve"> isolated script.</w:t>
-      </w:r>
-    </w:p>
-    <w:p>
-      <w:pPr>
-        <w:spacing w:after="120" w:line="360" w:lineRule="auto"/>
-        <w:jc w:val="both"/>
-      </w:pPr>
-      <w:r>
-        <w:rPr>
-          <w:b/>
-        </w:rPr>
-        <w:t xml:space="preserve">[33] Performance Benchmarks Verification (13 pages): </w:t>
-      </w:r>
-      <w:r>
-        <w:t xml:space="preserve">Companion to Sections 5.3.1, 5.3.2, and 5.3.3. Contains reproducible SQL scripts for independently verifying all benchmark results: (1) ETL Load Time — batch-level, step-level, and individual step timing with record counts; (2) Query Performance — Gold vs Raw Vault query pairs for Simple (24ms vs 199ms), Medium (18ms vs 123ms), and Complex (771ms vs 798ms) patterns; (3) Scalability Analysis — throughput verification across 5 data volumes. Includes </w:t>
-      </w:r>
-      <w:proofErr w:type="spellStart"/>
-      <w:r>
-        <w:t>Verify_Benchmarks.sql</w:t>
-      </w:r>
-      <w:proofErr w:type="spellEnd"/>
-      <w:r>
-        <w:t xml:space="preserve"> isolated script and 14-point verification checklist.</w:t>
-      </w:r>
-    </w:p>
-    <w:p>
-      <w:pPr>
-        <w:spacing w:after="120" w:line="360" w:lineRule="auto"/>
-        <w:jc w:val="both"/>
-      </w:pPr>
-      <w:r>
-        <w:rPr>
-          <w:b/>
-        </w:rPr>
-        <w:t xml:space="preserve">[34] Source Database Verification (8 pages): </w:t>
-      </w:r>
-      <w:r>
-        <w:t xml:space="preserve">Companion to Section 4.1. Contains a 12-point validation checklist for the simulated </w:t>
-      </w:r>
-      <w:proofErr w:type="spellStart"/>
-      <w:r>
-        <w:t>TaxSystemDB</w:t>
-      </w:r>
-      <w:proofErr w:type="spellEnd"/>
-      <w:r>
-        <w:t xml:space="preserve"> source database: 9 tables, 58,813 records, zero orphan records, zero NULL violations, and realistic data distributions verified via SQL queries. Includes </w:t>
-      </w:r>
-      <w:proofErr w:type="spellStart"/>
-      <w:r>
-        <w:t>Verify_SourceDB.sql</w:t>
-      </w:r>
-      <w:proofErr w:type="spellEnd"/>
-      <w:r>
-        <w:t xml:space="preserve"> isolated script.</w:t>
-      </w:r>
-    </w:p>
     <w:sectPr>
       <w:footerReference w:type="default" r:id="rId21"/>
       <w:pgSz w:w="11906" w:h="16838"/>

</xml_diff>